<commit_message>
generator: full name extended, works sections, phone formatting
</commit_message>
<xml_diff>
--- a/backend/app/templates/contract_template.docx
+++ b/backend/app/templates/contract_template.docx
@@ -488,6 +488,28 @@
           <w:szCs w:val="24"/>
         </w:rPr>
         <w:t>{% if works_stages %}{{ works_stages }}{% endif %}</w:t>
+      </w:r>
+    </w:p>
+    <w:p>
+      <w:pPr>
+        <w:widowControl/>
+        <w:ind w:firstLine="0"/>
+        <w:jc w:val="both"/>
+        <w:rPr>
+          <w:snapToGrid/>
+          <w:spacing w:val="-10"/>
+          <w:sz w:val="24"/>
+          <w:szCs w:val="24"/>
+        </w:rPr>
+      </w:pPr>
+      <w:r>
+        <w:rPr>
+          <w:snapToGrid/>
+          <w:spacing w:val="-10"/>
+          <w:sz w:val="24"/>
+          <w:szCs w:val="24"/>
+        </w:rPr>
+        <w:t>{% if works_results_header %}{{ works_results_header }}{% endif %}</w:t>
       </w:r>
     </w:p>
     <w:p>

</xml_diff>

<commit_message>
fix template: hide paragraph 1.2 when no basis
</commit_message>
<xml_diff>
--- a/backend/app/templates/contract_template.docx
+++ b/backend/app/templates/contract_template.docx
@@ -156,43 +156,7 @@
                 <w:sz w:val="24"/>
                 <w:szCs w:val="24"/>
               </w:rPr>
-              <w:t>«</w:t>
-            </w:r>
-            <w:r>
-              <w:rPr>
-                <w:color w:val="000000"/>
-                <w:spacing w:val="-10"/>
-                <w:sz w:val="24"/>
-                <w:szCs w:val="24"/>
-              </w:rPr>
-              <w:t>{{ contract_day }}</w:t>
-            </w:r>
-            <w:r>
-              <w:rPr>
-                <w:color w:val="000000"/>
-                <w:spacing w:val="-10"/>
-                <w:sz w:val="24"/>
-                <w:szCs w:val="24"/>
-              </w:rPr>
-              <w:t xml:space="preserve">» </w:t>
-            </w:r>
-            <w:r>
-              <w:rPr>
-                <w:color w:val="000000"/>
-                <w:spacing w:val="-10"/>
-                <w:sz w:val="24"/>
-                <w:szCs w:val="24"/>
-              </w:rPr>
-              <w:t>{{ contract_month_year }}</w:t>
-            </w:r>
-            <w:r>
-              <w:rPr>
-                <w:color w:val="000000"/>
-                <w:spacing w:val="-10"/>
-                <w:sz w:val="24"/>
-                <w:szCs w:val="24"/>
-              </w:rPr>
-              <w:t xml:space="preserve"> г.</w:t>
+              <w:t>«{{ contract_day }}» {{ contract_month_year }} г.</w:t>
             </w:r>
             <w:bookmarkEnd w:id="1"/>
           </w:p>
@@ -252,25 +216,7 @@
           <w:sz w:val="24"/>
           <w:szCs w:val="24"/>
         </w:rPr>
-        <w:t xml:space="preserve"> с одной стороны, и </w:t>
-      </w:r>
-      <w:r>
-        <w:rPr>
-          <w:snapToGrid/>
-          <w:spacing w:val="-10"/>
-          <w:sz w:val="24"/>
-          <w:szCs w:val="24"/>
-        </w:rPr>
-        <w:t>{{ contractor_full_name }}</w:t>
-      </w:r>
-      <w:r>
-        <w:rPr>
-          <w:snapToGrid/>
-          <w:spacing w:val="-10"/>
-          <w:sz w:val="24"/>
-          <w:szCs w:val="24"/>
-        </w:rPr>
-        <w:t>, именуемый в дальнейшем «Исполнитель», с другой стороны, заключили настоящий договор о нижеследующем:</w:t>
+        <w:t xml:space="preserve"> с одной стороны, и {{ contractor_full_name }}, именуемый в дальнейшем «Исполнитель», с другой стороны, заключили настоящий договор о нижеследующем:</w:t>
       </w:r>
     </w:p>
     <w:p>
@@ -332,51 +278,7 @@
           <w:szCs w:val="24"/>
           <w:u w:val="none"/>
         </w:rPr>
-        <w:t xml:space="preserve">Заказчик поручает, а Исполнитель принимает на себя обязательства выполнить работы по объекту: «{{ object_full_name }}</w:t>
-      </w:r>
-      <w:r>
-        <w:rPr>
-          <w:i w:val="0"/>
-          <w:snapToGrid/>
-          <w:spacing w:val="-10"/>
-          <w:sz w:val="24"/>
-          <w:szCs w:val="24"/>
-          <w:u w:val="none"/>
-        </w:rPr>
-        <w:t/>
-      </w:r>
-      <w:r>
-        <w:rPr>
-          <w:i w:val="0"/>
-          <w:snapToGrid/>
-          <w:spacing w:val="-10"/>
-          <w:sz w:val="24"/>
-          <w:szCs w:val="24"/>
-          <w:u w:val="none"/>
-        </w:rPr>
-        <w:t/>
-      </w:r>
-      <w:r>
-        <w:rPr>
-          <w:i w:val="0"/>
-          <w:snapToGrid/>
-          <w:spacing w:val="-10"/>
-          <w:sz w:val="24"/>
-          <w:szCs w:val="24"/>
-          <w:u w:val="none"/>
-        </w:rPr>
-        <w:t/>
-      </w:r>
-      <w:r>
-        <w:rPr>
-          <w:i w:val="0"/>
-          <w:snapToGrid/>
-          <w:spacing w:val="-10"/>
-          <w:sz w:val="24"/>
-          <w:szCs w:val="24"/>
-          <w:u w:val="none"/>
-        </w:rPr>
-        <w:t>».</w:t>
+        <w:t>Заказчик поручает, а Исполнитель принимает на себя обязательства выполнить работы по объекту: «{{ object_full_name }}».</w:t>
       </w:r>
     </w:p>
     <w:p>
@@ -394,7 +296,7 @@
           <w:sz w:val="24"/>
           <w:szCs w:val="24"/>
         </w:rPr>
-        <w:t xml:space="preserve">1.2.       </w:t>
+        <w:t xml:space="preserve">{%p if basis_enabled %}1.2.       </w:t>
       </w:r>
       <w:r>
         <w:rPr>
@@ -403,7 +305,7 @@
           <w:sz w:val="24"/>
           <w:szCs w:val="24"/>
         </w:rPr>
-        <w:t xml:space="preserve">{{ basis_text }}</w:t>
+        <w:t xml:space="preserve">{{ basis_text }}{%p endif %}</w:t>
       </w:r>
     </w:p>
     <w:p>

</xml_diff>